<commit_message>
more formal midterm script, add pdf, sync notes in both pptx
</commit_message>
<xml_diff>
--- a/Team01_Midterm_Script.docx
+++ b/Team01_Midterm_Script.docx
@@ -7,28 +7,22 @@
         <w:pStyle w:val="Title"/>
       </w:pPr>
       <w:r>
-        <w:t>Midterm Presentation Script</w:t>
+        <w:t>Midterm Progress Presentation Script</w:t>
       </w:r>
     </w:p>
     <w:p>
       <w:r>
-        <w:t>CIS 4930 ML for Computer Systems. Team 01. Presenter: Tuan Khang Phan.</w:t>
+        <w:t>CIS 4930 ML for Computer Systems, Team 01</w:t>
       </w:r>
     </w:p>
     <w:p>
       <w:r>
-        <w:t>Target time: about 4 minutes 40 seconds of talking, then questions.</w:t>
+        <w:t>Do Learned Indexes Still Win on Modern Hardware?</w:t>
       </w:r>
     </w:p>
     <w:p>
-      <w:pPr>
-        <w:ind w:left="432" w:hanging="288"/>
-      </w:pPr>
       <w:r>
-        <w:rPr>
-          <w:i w:val="0"/>
-        </w:rPr>
-        <w:t>- Phần trong ngoặc vuông là hành động, không đọc ra. Phần in nghiêng trong ngoặc tròn là cách đọc.</w:t>
+        <w:t>Team: Riyon Praveen, Vishakha Tiwari, Sevara Badriddinova, Tuan Khang Phan. Presenter: Tuan Khang Phan. Target duration: about 4.5 minutes, followed by questions.</w:t>
       </w:r>
     </w:p>
     <w:p>
@@ -36,7 +30,35 @@
         <w:pStyle w:val="Heading1"/>
       </w:pPr>
       <w:r>
-        <w:t>Timing</w:t>
+        <w:t>1. Project Overview</w:t>
+      </w:r>
+    </w:p>
+    <w:p>
+      <w:r>
+        <w:t>Database systems rely on index structures to locate records quickly. The most widely used structure, the B+tree, finds a key through a sequence of comparisons. Each comparison may require a slow access to main memory.</w:t>
+      </w:r>
+    </w:p>
+    <w:p>
+      <w:r>
+        <w:t>Kraska et al. (2018) proposed learned indexes, which replace the tree with a model that predicts the position of a key in a sorted array. They reported lookups up to 70 percent faster than a cache-optimized B+tree, with an order of magnitude less memory. Those results were obtained on hardware that is now several years old.</w:t>
+      </w:r>
+    </w:p>
+    <w:p>
+      <w:r>
+        <w:t>Our project determines whether, and under which conditions, this advantage still holds on current processors. We compare four learned indexes (RMI, PGM-index, RadixSpline and ALEX) against a B+tree, a hash table and binary search, using the SOSD benchmark on real and synthetic datasets. We measure latency, throughput and memory, use hardware performance counters to explain the results, test known weaknesses such as skewed data and inserts, and repeat key experiments on AMD, Intel and ARM processors.</w:t>
+      </w:r>
+    </w:p>
+    <w:p>
+      <w:r>
+        <w:t>At the midterm, a first experiment on one processor shows a 6.5 times speedup over binary search on uniform data, and a much smaller gain on skewed data.</w:t>
+      </w:r>
+    </w:p>
+    <w:p>
+      <w:pPr>
+        <w:pStyle w:val="Heading1"/>
+      </w:pPr>
+      <w:r>
+        <w:t>2. Presentation Structure</w:t>
       </w:r>
     </w:p>
     <w:tbl>
@@ -325,11 +347,16 @@
     </w:tbl>
     <w:p/>
     <w:p>
+      <w:r>
+        <w:t>Text in square brackets is a presenter action and is not spoken.</w:t>
+      </w:r>
+    </w:p>
+    <w:p>
       <w:pPr>
         <w:pStyle w:val="Heading1"/>
       </w:pPr>
       <w:r>
-        <w:t>Script</w:t>
+        <w:t>3. Script</w:t>
       </w:r>
     </w:p>
     <w:p>
@@ -341,11 +368,14 @@
       </w:r>
     </w:p>
     <w:p>
+      <w:pPr>
+        <w:ind w:left="432" w:hanging="288"/>
+      </w:pPr>
       <w:r>
         <w:rPr>
-          <w:i/>
+          <w:i w:val="0"/>
         </w:rPr>
-        <w:t>Database phải quyết định key nằm ở đâu trong mảng đã sắp xếp. Đoán sai không ra kết quả sai, chỉ chậm hơn.</w:t>
+        <w:t>- Hello, everyone. We are Team 1, and our project examines whether learned indexes still outperform traditional index structures on modern hardware.</w:t>
       </w:r>
     </w:p>
     <w:p>
@@ -356,54 +386,7 @@
         <w:rPr>
           <w:i w:val="0"/>
         </w:rPr>
-        <w:t xml:space="preserve">- Hello everyone. We are Team 1. Our project asks whether learned indexes </w:t>
-      </w:r>
-      <w:r>
-        <w:rPr>
-          <w:i/>
-        </w:rPr>
-        <w:t>(LURND IN‑dek‑siz)</w:t>
-      </w:r>
-      <w:r>
-        <w:rPr>
-          <w:i w:val="0"/>
-        </w:rPr>
-        <w:t xml:space="preserve"> still beat traditional indexes on modern hardware.</w:t>
-      </w:r>
-    </w:p>
-    <w:p>
-      <w:pPr>
-        <w:ind w:left="432" w:hanging="288"/>
-      </w:pPr>
-      <w:r>
-        <w:rPr>
-          <w:i w:val="0"/>
-        </w:rPr>
-        <w:t xml:space="preserve">- A database lookup must decide where a key is stored in a sorted array. Today, a B+tree </w:t>
-      </w:r>
-      <w:r>
-        <w:rPr>
-          <w:i/>
-        </w:rPr>
-        <w:t>(bee‑plus tree)</w:t>
-      </w:r>
-      <w:r>
-        <w:rPr>
-          <w:i w:val="0"/>
-        </w:rPr>
-        <w:t xml:space="preserve"> makes this decision with a series of comparisons. A wrong step does not give a wrong answer, but it costs extra cache misses, about one hundred nanoseconds </w:t>
-      </w:r>
-      <w:r>
-        <w:rPr>
-          <w:i/>
-        </w:rPr>
-        <w:t>(NAN‑oh‑sek‑unds)</w:t>
-      </w:r>
-      <w:r>
-        <w:rPr>
-          <w:i w:val="0"/>
-        </w:rPr>
-        <w:t xml:space="preserve"> each.</w:t>
+        <w:t>- Every database lookup must determine where a key is stored within a sorted array. Today, this decision is typically made by a B+tree, which moves from the root to a leaf through a sequence of comparisons. An imprecise step never produces an incorrect result, but each additional step can cause a cache miss, which costs roughly one hundred nanoseconds.</w:t>
       </w:r>
     </w:p>
     <w:p>
@@ -415,14 +398,6 @@
       </w:r>
     </w:p>
     <w:p>
-      <w:r>
-        <w:rPr>
-          <w:i/>
-        </w:rPr>
-        <w:t>Đối thủ cần đánh bại là binary search: 525 ns mỗi lần tìm với 100 triệu key.</w:t>
-      </w:r>
-    </w:p>
-    <w:p>
       <w:pPr>
         <w:ind w:left="432" w:hanging="288"/>
       </w:pPr>
@@ -430,19 +405,7 @@
         <w:rPr>
           <w:i w:val="0"/>
         </w:rPr>
-        <w:t xml:space="preserve">- Our baseline is binary search over the sorted array, which is the reference baseline in the SOSD </w:t>
-      </w:r>
-      <w:r>
-        <w:rPr>
-          <w:i/>
-        </w:rPr>
-        <w:t>(ess‑oh‑ess‑dee)</w:t>
-      </w:r>
-      <w:r>
-        <w:rPr>
-          <w:i w:val="0"/>
-        </w:rPr>
-        <w:t xml:space="preserve"> benchmark. On our machine, it takes 525 nanoseconds per lookup at one hundred million keys. A tuned B+tree will be added next.</w:t>
+        <w:t>- Our baseline is binary search over the sorted array, which is the reference baseline in the SOSD benchmark. On our test machine, it requires 525 nanoseconds per lookup at one hundred million keys. A tuned B+tree will be added as a stronger baseline in the next phase.</w:t>
       </w:r>
     </w:p>
     <w:p>
@@ -454,11 +417,14 @@
       </w:r>
     </w:p>
     <w:p>
+      <w:pPr>
+        <w:ind w:left="432" w:hanging="288"/>
+      </w:pPr>
       <w:r>
         <w:rPr>
-          <w:i/>
+          <w:i w:val="0"/>
         </w:rPr>
-        <w:t>Learned index dùng model đoán vị trí của key. Nhãn để train có sẵn, và kết quả luôn đúng nhờ sai số được giới hạn.</w:t>
+        <w:t>- A learned index replaces the tree with a model that predicts the position of a key. We will evaluate four designs: the Recursive Model Index, or RMI, the PGM-index, RadixSpline, and ALEX, which also supports inserts.</w:t>
       </w:r>
     </w:p>
     <w:p>
@@ -469,66 +435,7 @@
         <w:rPr>
           <w:i w:val="0"/>
         </w:rPr>
-        <w:t xml:space="preserve">- A learned index replaces the tree with a model that predicts the position of a key. We will test four designs: RMI </w:t>
-      </w:r>
-      <w:r>
-        <w:rPr>
-          <w:i/>
-        </w:rPr>
-        <w:t>(ar‑em‑eye)</w:t>
-      </w:r>
-      <w:r>
-        <w:rPr>
-          <w:i w:val="0"/>
-        </w:rPr>
-        <w:t xml:space="preserve">, PGM </w:t>
-      </w:r>
-      <w:r>
-        <w:rPr>
-          <w:i/>
-        </w:rPr>
-        <w:t>(pee‑jee‑em)</w:t>
-      </w:r>
-      <w:r>
-        <w:rPr>
-          <w:i w:val="0"/>
-        </w:rPr>
-        <w:t xml:space="preserve">, RadixSpline </w:t>
-      </w:r>
-      <w:r>
-        <w:rPr>
-          <w:i/>
-        </w:rPr>
-        <w:t>(RAY‑diks‑spline)</w:t>
-      </w:r>
-      <w:r>
-        <w:rPr>
-          <w:i w:val="0"/>
-        </w:rPr>
-        <w:t xml:space="preserve">, and ALEX </w:t>
-      </w:r>
-      <w:r>
-        <w:rPr>
-          <w:i/>
-        </w:rPr>
-        <w:t>(AL‑eks)</w:t>
-      </w:r>
-      <w:r>
-        <w:rPr>
-          <w:i w:val="0"/>
-        </w:rPr>
-        <w:t>.</w:t>
-      </w:r>
-    </w:p>
-    <w:p>
-      <w:pPr>
-        <w:ind w:left="432" w:hanging="288"/>
-      </w:pPr>
-      <w:r>
-        <w:rPr>
-          <w:i w:val="0"/>
-        </w:rPr>
-        <w:t>- The training labels are free, because they are simply the positions of the keys. The model also stores its maximum error, so after one prediction we only search a small window, and the answer is always exact.</w:t>
+        <w:t>- Training labels are available at no cost, since they are simply the positions of the keys. Each model also records its maximum prediction error, so a lookup requires one prediction followed by a search within a small, bounded window. The result is therefore always exact.</w:t>
       </w:r>
     </w:p>
     <w:p>
@@ -540,14 +447,6 @@
       </w:r>
     </w:p>
     <w:p>
-      <w:r>
-        <w:rPr>
-          <w:i/>
-        </w:rPr>
-        <w:t>Phần quan trọng nhất. Chỉ vào plot khi nói. Binary search tăng vọt khi dữ liệu lớn hơn cache, learned index gần như phẳng: nhanh hơn 6.5 lần.</w:t>
-      </w:r>
-    </w:p>
-    <w:p>
       <w:pPr>
         <w:ind w:left="432" w:hanging="288"/>
       </w:pPr>
@@ -555,19 +454,7 @@
         <w:rPr>
           <w:i w:val="0"/>
         </w:rPr>
-        <w:t xml:space="preserve">- For our first result, we built a simple two-stage RMI and compared it with binary search, on uniform and lognormal </w:t>
-      </w:r>
-      <w:r>
-        <w:rPr>
-          <w:i/>
-        </w:rPr>
-        <w:t>(log‑NOR‑mul)</w:t>
-      </w:r>
-      <w:r>
-        <w:rPr>
-          <w:i w:val="0"/>
-        </w:rPr>
-        <w:t xml:space="preserve"> keys, from one hundred thousand to one hundred million keys.</w:t>
+        <w:t>- For our first result, we implemented a two-stage RMI and compared it with binary search on uniform and lognormal key distributions, ranging from one hundred thousand to one hundred million keys.</w:t>
       </w:r>
     </w:p>
     <w:p>
@@ -590,7 +477,7 @@
         <w:rPr>
           <w:i w:val="0"/>
         </w:rPr>
-        <w:t xml:space="preserve"> The horizontal axis is the number of keys, and the vertical axis is the time per lookup. The dashed lines are binary search, and the solid lines are the learned index.</w:t>
+        <w:t xml:space="preserve"> The horizontal axis shows the number of keys, and the vertical axis shows the median time per lookup. The dashed lines represent binary search, and the solid lines represent the learned index.</w:t>
       </w:r>
     </w:p>
     <w:p>
@@ -613,7 +500,7 @@
         <w:rPr>
           <w:i w:val="0"/>
         </w:rPr>
-        <w:t xml:space="preserve"> After this line, the data no longer fits in the 16-megabyte cache. Binary search then has to wait on main memory several times, so its time grows quickly.</w:t>
+        <w:t xml:space="preserve"> Beyond this line, the data no longer fits in the 16-megabyte L3 cache. Binary search must then wait on main memory several times per lookup, and its latency rises sharply.</w:t>
       </w:r>
     </w:p>
     <w:p>
@@ -636,7 +523,7 @@
         <w:rPr>
           <w:i w:val="0"/>
         </w:rPr>
-        <w:t xml:space="preserve"> The learned index stays almost flat. At one hundred million keys, it reduces the lookup time from 525 to 81 nanoseconds. That is about 6.5 times faster, with a model of only 2.3 megabytes.</w:t>
+        <w:t xml:space="preserve"> The learned index remains nearly flat. At one hundred million keys, it reduces the lookup time from 525 to 81 nanoseconds. This is a speedup of approximately 6.5 times, with a model of only 2.3 megabytes.</w:t>
       </w:r>
     </w:p>
     <w:p>
@@ -647,19 +534,7 @@
         <w:rPr>
           <w:i w:val="0"/>
         </w:rPr>
-        <w:t xml:space="preserve">- These numbers come from an AMD Ryzen </w:t>
-      </w:r>
-      <w:r>
-        <w:rPr>
-          <w:i/>
-        </w:rPr>
-        <w:t>(RY‑zen)</w:t>
-      </w:r>
-      <w:r>
-        <w:rPr>
-          <w:i w:val="0"/>
-        </w:rPr>
-        <w:t xml:space="preserve"> laptop processor. Each point is the median of five runs of two million lookups.</w:t>
+        <w:t>- These measurements were taken on an AMD Ryzen AI 7 350 laptop processor. Each point is the median of five runs of two million random lookups, following a warm-up run.</w:t>
       </w:r>
     </w:p>
     <w:p>
@@ -671,11 +546,14 @@
       </w:r>
     </w:p>
     <w:p>
+      <w:pPr>
+        <w:ind w:left="432" w:hanging="288"/>
+      </w:pPr>
       <w:r>
         <w:rPr>
-          <w:i/>
+          <w:i w:val="0"/>
         </w:rPr>
-        <w:t>Dữ liệu lệch (lognormal) làm model đoán sai nhiều hơn, nên lợi thế giảm mạnh. Model quá nhỏ còn thua binary search.</w:t>
+        <w:t>- The most significant finding concerns the key distribution. With the same model size, lookups on lognormal keys required 226 nanoseconds, compared with 81 nanoseconds on uniform keys. With a very small model, the learned index was even slower than binary search.</w:t>
       </w:r>
     </w:p>
     <w:p>
@@ -686,7 +564,7 @@
         <w:rPr>
           <w:i w:val="0"/>
         </w:rPr>
-        <w:t>- What surprised us was the effect of the key distribution. With the same model size, lognormal keys took 226 nanoseconds, compared with 81 for uniform keys. With a very small model, the learned index was even slower than binary search.</w:t>
+        <w:t>- A simple linear model cannot capture a skewed distribution, so its error window, and therefore its search cost, grows. This indicates that results on uniform data overstate the benefit of learned indexes.</w:t>
       </w:r>
     </w:p>
     <w:p>
@@ -697,18 +575,7 @@
         <w:rPr>
           <w:i w:val="0"/>
         </w:rPr>
-        <w:t>- The reason is that a simple linear model cannot follow skewed data, so its error window becomes large. This taught us that uniform data makes learned indexes look better than they really are.</w:t>
-      </w:r>
-    </w:p>
-    <w:p>
-      <w:pPr>
-        <w:ind w:left="432" w:hanging="288"/>
-      </w:pPr>
-      <w:r>
-        <w:rPr>
-          <w:i w:val="0"/>
-        </w:rPr>
-        <w:t>- We also found that this processor has two types of cores. Without pinning the program to one core, the results were about ten percent slower and noisier.</w:t>
+        <w:t>- We also observed that this processor combines two types of cores. Without pinning the benchmark to a single core, the results were approximately ten percent slower and considerably less stable.</w:t>
       </w:r>
     </w:p>
     <w:p>
@@ -720,14 +587,6 @@
       </w:r>
     </w:p>
     <w:p>
-      <w:r>
-        <w:rPr>
-          <w:i/>
-        </w:rPr>
-        <w:t>Bước tiếp theo: dữ liệu thật, đo trên 3 loại CPU, dùng perf để đếm cache miss. Rủi ro là perf không chạy trên WSL và Mac.</w:t>
-      </w:r>
-    </w:p>
-    <w:p>
       <w:pPr>
         <w:ind w:left="432" w:hanging="288"/>
       </w:pPr>
@@ -735,19 +594,7 @@
         <w:rPr>
           <w:i w:val="0"/>
         </w:rPr>
-        <w:t xml:space="preserve">- In the next six weeks, the key experiment is the full SOSD benchmark on four real datasets, with hardware counters, on AMD, Intel, and ARM processors. The main risk is that the perf </w:t>
-      </w:r>
-      <w:r>
-        <w:rPr>
-          <w:i/>
-        </w:rPr>
-        <w:t>(purf)</w:t>
-      </w:r>
-      <w:r>
-        <w:rPr>
-          <w:i w:val="0"/>
-        </w:rPr>
-        <w:t xml:space="preserve"> tool does not work on WSL or macOS, so our fallback is cloud machines on AWS.</w:t>
+        <w:t>- Over the next six weeks, the decisive experiment is the full SOSD benchmark on four real-world datasets, with hardware performance counters, on AMD, Intel, and ARM processors. The principal risk is that the Linux perf tool cannot access hardware counters under WSL or macOS. Our fallback is to use bare-metal cloud instances on AWS.</w:t>
       </w:r>
     </w:p>
     <w:p>
@@ -759,11 +606,14 @@
       </w:r>
     </w:p>
     <w:p>
+      <w:pPr>
+        <w:ind w:left="432" w:hanging="288"/>
+      </w:pPr>
       <w:r>
         <w:rPr>
-          <w:i/>
+          <w:i w:val="0"/>
         </w:rPr>
-        <w:t>Trả lời nhanh 5 câu gate check, rồi kết thúc bằng một câu hỏi cho lớp và đứng chờ câu trả lời.</w:t>
+        <w:t>- Regarding the gate check, an incorrect prediction is safe, the labels are free, and the model is small. Whether the approach beats a tuned B+tree, and whether it withstands insert-heavy workloads, remains to be determined.</w:t>
       </w:r>
     </w:p>
     <w:p>
@@ -774,18 +624,7 @@
         <w:rPr>
           <w:i w:val="0"/>
         </w:rPr>
-        <w:t>- For the gate check, a wrong guess is safe, the labels are free, and the model is small. We are not yet sure whether we beat a tuned B+tree, or whether the method survives inserts.</w:t>
-      </w:r>
-    </w:p>
-    <w:p>
-      <w:pPr>
-        <w:ind w:left="432" w:hanging="288"/>
-      </w:pPr>
-      <w:r>
-        <w:rPr>
-          <w:i w:val="0"/>
-        </w:rPr>
-        <w:t>- Our question for the class is: should we focus next on more real datasets, or on insert-heavy workloads? Thank you.</w:t>
+        <w:t>- We would like to close with a question for the class: should our next priority be additional real-world datasets, or insert-heavy workloads? Thank you.</w:t>
       </w:r>
     </w:p>
     <w:p>
@@ -793,7 +632,7 @@
         <w:pStyle w:val="Heading1"/>
       </w:pPr>
       <w:r>
-        <w:t>Numbers to remember</w:t>
+        <w:t>4. Key Figures</w:t>
       </w:r>
     </w:p>
     <w:tbl>
@@ -820,7 +659,7 @@
               <w:rPr>
                 <w:b/>
               </w:rPr>
-              <w:t>Number</w:t>
+              <w:t>Figure</w:t>
             </w:r>
           </w:p>
         </w:tc>
@@ -870,7 +709,7 @@
               <w:rPr>
                 <w:b w:val="0"/>
               </w:rPr>
-              <w:t>binary search, 100 million keys</w:t>
+              <w:t>Binary search, 100 million keys</w:t>
             </w:r>
           </w:p>
         </w:tc>
@@ -904,7 +743,7 @@
               <w:rPr>
                 <w:b w:val="0"/>
               </w:rPr>
-              <w:t>learned index, 100 million uniform keys</w:t>
+              <w:t>Learned index, 100 million uniform keys</w:t>
             </w:r>
           </w:p>
         </w:tc>
@@ -938,7 +777,7 @@
               <w:rPr>
                 <w:b w:val="0"/>
               </w:rPr>
-              <w:t>speedup (525 divided by 81)</w:t>
+              <w:t>Speedup over binary search (525 / 81)</w:t>
             </w:r>
           </w:p>
         </w:tc>
@@ -972,7 +811,7 @@
               <w:rPr>
                 <w:b w:val="0"/>
               </w:rPr>
-              <w:t>size of the model</w:t>
+              <w:t>Size of the learned model</w:t>
             </w:r>
           </w:p>
         </w:tc>
@@ -1006,7 +845,7 @@
               <w:rPr>
                 <w:b w:val="0"/>
               </w:rPr>
-              <w:t>learned index on skewed (lognormal) keys, same model size</w:t>
+              <w:t>Learned index on lognormal keys, same model size</w:t>
             </w:r>
           </w:p>
         </w:tc>
@@ -1040,7 +879,7 @@
               <w:rPr>
                 <w:b w:val="0"/>
               </w:rPr>
-              <w:t>size of the L3 cache (the dotted line on the plot)</w:t>
+              <w:t>L3 cache size (dotted line on the plot)</w:t>
             </w:r>
           </w:p>
         </w:tc>
@@ -1052,18 +891,19 @@
         <w:pStyle w:val="Heading1"/>
       </w:pPr>
       <w:r>
-        <w:t>Likely questions</w:t>
+        <w:t>5. Anticipated Questions</w:t>
       </w:r>
     </w:p>
     <w:p>
       <w:pPr>
+        <w:keepNext/>
         <w:spacing w:after="40"/>
       </w:pPr>
       <w:r>
         <w:rPr>
           <w:b/>
         </w:rPr>
-        <w:t>Why compare against binary search and not a B+tree?</w:t>
+        <w:t>Why compare against binary search rather than a B+tree?</w:t>
       </w:r>
     </w:p>
     <w:p>
@@ -1074,18 +914,19 @@
         <w:rPr>
           <w:i w:val="0"/>
         </w:rPr>
-        <w:t>- Binary search is the reference baseline in SOSD. A tuned B+tree is usually faster on large data, so our 6.5 times is an upper bound. The B+tree is the next baseline we add.</w:t>
+        <w:t>- Binary search is the reference baseline in SOSD. A tuned B+tree is usually faster on large data, so the 6.5 times speedup should be read as an upper bound. The B+tree is the next baseline we will add.</w:t>
       </w:r>
     </w:p>
     <w:p>
       <w:pPr>
+        <w:keepNext/>
         <w:spacing w:after="40"/>
       </w:pPr>
       <w:r>
         <w:rPr>
           <w:b/>
         </w:rPr>
-        <w:t>You tuned the learned index but not the baseline. Is that fair?</w:t>
+        <w:t>The learned index was tuned, but the baseline was not. Is the comparison fair?</w:t>
       </w:r>
     </w:p>
     <w:p>
@@ -1096,18 +937,19 @@
         <w:rPr>
           <w:i w:val="0"/>
         </w:rPr>
-        <w:t>- Binary search has no parameter to tune. Even our smallest model, 0.6 megabytes, takes 97 nanoseconds at one hundred million keys, which is still about five times faster.</w:t>
+        <w:t>- Binary search has no parameter to tune. Even our smallest model, at 0.6 megabytes, requires 97 nanoseconds at one hundred million keys, which is still about five times faster.</w:t>
       </w:r>
     </w:p>
     <w:p>
       <w:pPr>
+        <w:keepNext/>
         <w:spacing w:after="40"/>
       </w:pPr>
       <w:r>
         <w:rPr>
           <w:b/>
         </w:rPr>
-        <w:t>Why does binary search slow down after 16 megabytes?</w:t>
+        <w:t>Why does binary search slow down beyond 16 megabytes?</w:t>
       </w:r>
     </w:p>
     <w:p>
@@ -1118,18 +960,19 @@
         <w:rPr>
           <w:i w:val="0"/>
         </w:rPr>
-        <w:t>- One hundred million keys need about 27 search steps. The first steps stay in cache, but the last ones each wait on main memory, about 100 nanoseconds each.</w:t>
+        <w:t>- One hundred million keys require about 27 search steps. The first steps remain in cache, but the final steps each wait on main memory, at roughly 100 nanoseconds per access.</w:t>
       </w:r>
     </w:p>
     <w:p>
       <w:pPr>
+        <w:keepNext/>
         <w:spacing w:after="40"/>
       </w:pPr>
       <w:r>
         <w:rPr>
           <w:b/>
         </w:rPr>
-        <w:t>What about inserts?</w:t>
+        <w:t>How do learned indexes handle inserts?</w:t>
       </w:r>
     </w:p>
     <w:p>
@@ -1140,11 +983,12 @@
         <w:rPr>
           <w:i w:val="0"/>
         </w:rPr>
-        <w:t>- A static model must be retrained after inserts. ALEX leaves gaps in its arrays so it can insert in place. Insert-heavy workloads are part of our next phase.</w:t>
+        <w:t>- A static model must be retrained after inserts. ALEX reserves gaps in its arrays so that it can insert in place. Insert-heavy workloads are part of our next phase.</w:t>
       </w:r>
     </w:p>
     <w:p>
       <w:pPr>
+        <w:keepNext/>
         <w:spacing w:after="40"/>
       </w:pPr>
       <w:r>
@@ -1162,7 +1006,7 @@
         <w:rPr>
           <w:i w:val="0"/>
         </w:rPr>
-        <w:t>- On this machine, for read-only uniform data against binary search, yes. Whether they hold on real data, against a tuned B+tree, and on other processors is what the rest of the project tests.</w:t>
+        <w:t>- On this machine, for read-only uniform data against binary search, they do. Whether they hold on real data, against a tuned B+tree, and on other processors is the subject of the remaining work.</w:t>
       </w:r>
     </w:p>
     <w:p>
@@ -1170,7 +1014,7 @@
         <w:pStyle w:val="Heading1"/>
       </w:pPr>
       <w:r>
-        <w:t>Delivery tips</w:t>
+        <w:t>6. Delivery Notes</w:t>
       </w:r>
     </w:p>
     <w:p>
@@ -1181,7 +1025,7 @@
         <w:rPr>
           <w:i w:val="0"/>
         </w:rPr>
-        <w:t>- Nói chậm, khoảng 130 từ mỗi phút. Ngừng một nhịp sau mỗi con số quan trọng.</w:t>
+        <w:t>- Speak at a measured pace, approximately 120 words per minute, and pause briefly after each key figure.</w:t>
       </w:r>
     </w:p>
     <w:p>
@@ -1192,7 +1036,7 @@
         <w:rPr>
           <w:i w:val="0"/>
         </w:rPr>
-        <w:t>- Ở ô 4, đứng cạnh màn hình và chỉ tay vào đúng đường đang nói tới.</w:t>
+        <w:t>- During Box 4, stand beside the screen and point to each line as it is described.</w:t>
       </w:r>
     </w:p>
     <w:p>
@@ -1203,18 +1047,7 @@
         <w:rPr>
           <w:i w:val="0"/>
         </w:rPr>
-        <w:t>- Nhìn vào người nghe, chỉ liếc xuống script khi chuyển ô.</w:t>
-      </w:r>
-    </w:p>
-    <w:p>
-      <w:pPr>
-        <w:ind w:left="432" w:hanging="288"/>
-      </w:pPr>
-      <w:r>
-        <w:rPr>
-          <w:i w:val="0"/>
-        </w:rPr>
-        <w:t>- Nếu bị hỏi điều chưa làm, cứ nói thật: "That is a good question. We have not tested that yet, but it is part of our plan."</w:t>
+        <w:t>- If a question concerns work not yet completed, state this directly and describe how the plan addresses it.</w:t>
       </w:r>
     </w:p>
     <w:sectPr>
@@ -1595,6 +1428,7 @@
     </w:pPr>
     <w:rPr>
       <w:rFonts w:ascii="Times New Roman" w:hAnsi="Times New Roman" w:eastAsia="Times New Roman"/>
+      <w:i w:val="0"/>
       <w:color w:val="000000"/>
       <w:sz w:val="24"/>
     </w:rPr>

</xml_diff>